<commit_message>
docs: update install guide with new features and git update guide
- Section 4.1: add equity chart overlay toggles description
- Section 4.6: new Settings page docs — Dark/Light/Custom theme,
  colour pickers, text size, inject_theme_css() usage
- Section 4.7: Batch Backtest renumbered
- Section 9: new — Keeping Up to Date (git pull, pip install,
  restart, handling conflicts, checking current version)
</commit_message>
<xml_diff>
--- a/MT5_Tools_Install_Guide.docx
+++ b/MT5_Tools_Install_Guide.docx
@@ -2872,19 +2872,19 @@
     </w:p>
     <w:p>
       <w:pPr>
-        <w:pStyle w:val="Heading2"/>
-        <w:spacing w:after="120" w:before="280"/>
+        <w:pStyle w:val="Heading3"/>
+        <w:spacing w:after="80" w:before="200"/>
       </w:pPr>
       <w:r>
         <w:rPr>
           <w:rFonts w:ascii="Arial" w:cs="Arial" w:eastAsia="Arial" w:hAnsi="Arial"/>
           <w:b/>
           <w:bCs/>
-          <w:color w:val="2E75B6"/>
-          <w:sz w:val="24"/>
-          <w:szCs w:val="24"/>
-        </w:rPr>
-        <w:t xml:space="preserve">4.2  Trade Compare</w:t>
+          <w:color w:val="404040"/>
+          <w:sz w:val="22"/>
+          <w:szCs w:val="22"/>
+        </w:rPr>
+        <w:t xml:space="preserve">Equity Chart Overlays</w:t>
       </w:r>
     </w:p>
     <w:p>
@@ -2900,15 +2900,7 @@
           <w:sz w:val="22"/>
           <w:szCs w:val="22"/>
         </w:rPr>
-        <w:t xml:space="preserve">Compares two trade history files to measure slippage, profit variance and timing differences — typically a backtest versus a real account run of the same EA.</w:t>
-      </w:r>
-    </w:p>
-    <w:p>
-      <w:pPr>
-        <w:spacing w:after="80" w:before="0"/>
-      </w:pPr>
-      <w:r>
-        <w:t xml:space="preserve"/>
+        <w:t xml:space="preserve">Four toggle checkboxes sit above every equity chart:</w:t>
       </w:r>
     </w:p>
     <w:p>
@@ -2927,7 +2919,7 @@
           <w:sz w:val="22"/>
           <w:szCs w:val="22"/>
         </w:rPr>
-        <w:t xml:space="preserve">Upload File A (reference, e.g. backtest) and File B (comparison, e.g. live account)</w:t>
+        <w:t xml:space="preserve">Account total — single combined equity curve (on by default)</w:t>
       </w:r>
     </w:p>
     <w:p>
@@ -2946,7 +2938,7 @@
           <w:sz w:val="22"/>
           <w:szCs w:val="22"/>
         </w:rPr>
-        <w:t xml:space="preserve">Match tolerance: 1–24 hours — trades within this window are paired by symbol + type + open time</w:t>
+        <w:t xml:space="preserve">By Strategy — one line per strategy/EA</w:t>
       </w:r>
     </w:p>
     <w:p>
@@ -2965,7 +2957,7 @@
           <w:sz w:val="22"/>
           <w:szCs w:val="22"/>
         </w:rPr>
-        <w:t xml:space="preserve">Outputs: matched/unmatched counts, aggregate stats, slippage summary, equity overlay chart, profit variance bar chart, matched trade detail table</w:t>
+        <w:t xml:space="preserve">By Symbol — one line per instrument</w:t>
       </w:r>
     </w:p>
     <w:p>
@@ -2984,42 +2976,23 @@
           <w:sz w:val="22"/>
           <w:szCs w:val="22"/>
         </w:rPr>
-        <w:t xml:space="preserve">CSV export of the comparison</w:t>
-      </w:r>
-    </w:p>
-    <w:p>
-      <w:pPr>
-        <w:spacing w:after="80" w:before="0"/>
-      </w:pPr>
-      <w:r>
-        <w:t xml:space="preserve"/>
-      </w:r>
-    </w:p>
-    <w:p>
-      <w:pPr>
-        <w:shd w:fill="EBF3FB" w:val="clear"/>
-        <w:spacing w:after="120" w:before="120"/>
-        <w:ind w:left="280" w:right="280"/>
-      </w:pPr>
-      <w:r>
-        <w:rPr>
-          <w:rFonts w:ascii="Arial" w:cs="Arial" w:eastAsia="Arial" w:hAnsi="Arial"/>
-          <w:b/>
-          <w:bCs/>
-          <w:color w:val="2E75B6"/>
-          <w:sz w:val="20"/>
-          <w:szCs w:val="20"/>
-        </w:rPr>
-        <w:t xml:space="preserve">NOTE  </w:t>
-      </w:r>
-      <w:r>
-        <w:rPr>
-          <w:rFonts w:ascii="Arial" w:cs="Arial" w:eastAsia="Arial" w:hAnsi="Arial"/>
-          <w:color w:val="666666"/>
-          <w:sz w:val="20"/>
-          <w:szCs w:val="20"/>
-        </w:rPr>
-        <w:t xml:space="preserve">Testing with matched backtest/live pairs for all formats is ongoing. Formats are verified but slippage analysis accuracy depends on data quality.</w:t>
+        <w:t xml:space="preserve">By Day of Week — one line per weekday</w:t>
+      </w:r>
+    </w:p>
+    <w:p>
+      <w:pPr>
+        <w:spacing w:after="60" w:before="60"/>
+      </w:pPr>
+      <w:r>
+        <w:rPr>
+          <w:rFonts w:ascii="Arial" w:cs="Arial" w:eastAsia="Arial" w:hAnsi="Arial"/>
+          <w:b w:val="false"/>
+          <w:bCs w:val="false"/>
+          <w:color w:val="404040"/>
+          <w:sz w:val="22"/>
+          <w:szCs w:val="22"/>
+        </w:rPr>
+        <w:t xml:space="preserve">Any combination can be enabled simultaneously. Each overlay uses a distinct colour and line style. Charts use a transparent background so they inherit the current page theme.</w:t>
       </w:r>
     </w:p>
     <w:p>
@@ -3044,7 +3017,7 @@
           <w:sz w:val="24"/>
           <w:szCs w:val="24"/>
         </w:rPr>
-        <w:t xml:space="preserve">4.3  Portfolio Builder</w:t>
+        <w:t xml:space="preserve">4.2  Trade Compare</w:t>
       </w:r>
     </w:p>
     <w:p>
@@ -3060,7 +3033,7 @@
           <w:sz w:val="22"/>
           <w:szCs w:val="22"/>
         </w:rPr>
-        <w:t xml:space="preserve">Loads multiple backtest files and builds a combined portfolio view with full statistics.</w:t>
+        <w:t xml:space="preserve">Compares two trade history files to measure slippage, profit variance and timing differences — typically a backtest versus a real account run of the same EA.</w:t>
       </w:r>
     </w:p>
     <w:p>
@@ -3087,7 +3060,7 @@
           <w:sz w:val="22"/>
           <w:szCs w:val="22"/>
         </w:rPr>
-        <w:t xml:space="preserve">Tabs: Overview, Trades, Equity Chart, Strategies, What-If, Portfolios</w:t>
+        <w:t xml:space="preserve">Upload File A (reference, e.g. backtest) and File B (comparison, e.g. live account)</w:t>
       </w:r>
     </w:p>
     <w:p>
@@ -3106,7 +3079,7 @@
           <w:sz w:val="22"/>
           <w:szCs w:val="22"/>
         </w:rPr>
-        <w:t xml:space="preserve">Overview: combined stats, filters (strategy, symbol, date slider)</w:t>
+        <w:t xml:space="preserve">Match tolerance: 1–24 hours — trades within this window are paired by symbol + type + open time</w:t>
       </w:r>
     </w:p>
     <w:p>
@@ -3125,7 +3098,7 @@
           <w:sz w:val="22"/>
           <w:szCs w:val="22"/>
         </w:rPr>
-        <w:t xml:space="preserve">Equity Chart: combined equity curve with peak drawdown panel and daily P&amp;L bars, smoothing slider, stagnation band</w:t>
+        <w:t xml:space="preserve">Outputs: matched/unmatched counts, aggregate stats, slippage summary, equity overlay chart, profit variance bar chart, matched trade detail table</w:t>
       </w:r>
     </w:p>
     <w:p>
@@ -3144,7 +3117,91 @@
           <w:sz w:val="22"/>
           <w:szCs w:val="22"/>
         </w:rPr>
-        <w:t xml:space="preserve">What-If: enter a target lot size to see scaled statistics</w:t>
+        <w:t xml:space="preserve">CSV export of the comparison</w:t>
+      </w:r>
+    </w:p>
+    <w:p>
+      <w:pPr>
+        <w:spacing w:after="80" w:before="0"/>
+      </w:pPr>
+      <w:r>
+        <w:t xml:space="preserve"/>
+      </w:r>
+    </w:p>
+    <w:p>
+      <w:pPr>
+        <w:shd w:fill="EBF3FB" w:val="clear"/>
+        <w:spacing w:after="120" w:before="120"/>
+        <w:ind w:left="280" w:right="280"/>
+      </w:pPr>
+      <w:r>
+        <w:rPr>
+          <w:rFonts w:ascii="Arial" w:cs="Arial" w:eastAsia="Arial" w:hAnsi="Arial"/>
+          <w:b/>
+          <w:bCs/>
+          <w:color w:val="2E75B6"/>
+          <w:sz w:val="20"/>
+          <w:szCs w:val="20"/>
+        </w:rPr>
+        <w:t xml:space="preserve">NOTE  </w:t>
+      </w:r>
+      <w:r>
+        <w:rPr>
+          <w:rFonts w:ascii="Arial" w:cs="Arial" w:eastAsia="Arial" w:hAnsi="Arial"/>
+          <w:color w:val="666666"/>
+          <w:sz w:val="20"/>
+          <w:szCs w:val="20"/>
+        </w:rPr>
+        <w:t xml:space="preserve">Testing with matched backtest/live pairs for all formats is ongoing. Formats are verified but slippage analysis accuracy depends on data quality.</w:t>
+      </w:r>
+    </w:p>
+    <w:p>
+      <w:pPr>
+        <w:spacing w:after="80" w:before="0"/>
+      </w:pPr>
+      <w:r>
+        <w:t xml:space="preserve"/>
+      </w:r>
+    </w:p>
+    <w:p>
+      <w:pPr>
+        <w:pStyle w:val="Heading2"/>
+        <w:spacing w:after="120" w:before="280"/>
+      </w:pPr>
+      <w:r>
+        <w:rPr>
+          <w:rFonts w:ascii="Arial" w:cs="Arial" w:eastAsia="Arial" w:hAnsi="Arial"/>
+          <w:b/>
+          <w:bCs/>
+          <w:color w:val="2E75B6"/>
+          <w:sz w:val="24"/>
+          <w:szCs w:val="24"/>
+        </w:rPr>
+        <w:t xml:space="preserve">4.3  Portfolio Builder</w:t>
+      </w:r>
+    </w:p>
+    <w:p>
+      <w:pPr>
+        <w:spacing w:after="60" w:before="60"/>
+      </w:pPr>
+      <w:r>
+        <w:rPr>
+          <w:rFonts w:ascii="Arial" w:cs="Arial" w:eastAsia="Arial" w:hAnsi="Arial"/>
+          <w:b w:val="false"/>
+          <w:bCs w:val="false"/>
+          <w:color w:val="404040"/>
+          <w:sz w:val="22"/>
+          <w:szCs w:val="22"/>
+        </w:rPr>
+        <w:t xml:space="preserve">Loads multiple backtest files and builds a combined portfolio view with full statistics.</w:t>
+      </w:r>
+    </w:p>
+    <w:p>
+      <w:pPr>
+        <w:spacing w:after="80" w:before="0"/>
+      </w:pPr>
+      <w:r>
+        <w:t xml:space="preserve"/>
       </w:r>
     </w:p>
     <w:p>
@@ -3163,73 +3220,7 @@
           <w:sz w:val="22"/>
           <w:szCs w:val="22"/>
         </w:rPr>
-        <w:t xml:space="preserve">Portfolios tab: create and name custom sub-portfolios from loaded strategies</w:t>
-      </w:r>
-    </w:p>
-    <w:p>
-      <w:pPr>
-        <w:spacing w:after="80" w:before="0"/>
-      </w:pPr>
-      <w:r>
-        <w:t xml:space="preserve"/>
-      </w:r>
-    </w:p>
-    <w:p>
-      <w:pPr>
-        <w:pStyle w:val="Heading2"/>
-        <w:spacing w:after="120" w:before="280"/>
-      </w:pPr>
-      <w:r>
-        <w:rPr>
-          <w:rFonts w:ascii="Arial" w:cs="Arial" w:eastAsia="Arial" w:hAnsi="Arial"/>
-          <w:b/>
-          <w:bCs/>
-          <w:color w:val="2E75B6"/>
-          <w:sz w:val="24"/>
-          <w:szCs w:val="24"/>
-        </w:rPr>
-        <w:t xml:space="preserve">4.4  Portfolio Master</w:t>
-      </w:r>
-    </w:p>
-    <w:p>
-      <w:pPr>
-        <w:spacing w:after="60" w:before="60"/>
-      </w:pPr>
-      <w:r>
-        <w:rPr>
-          <w:rFonts w:ascii="Arial" w:cs="Arial" w:eastAsia="Arial" w:hAnsi="Arial"/>
-          <w:b w:val="false"/>
-          <w:bCs w:val="false"/>
-          <w:color w:val="404040"/>
-          <w:sz w:val="22"/>
-          <w:szCs w:val="22"/>
-        </w:rPr>
-        <w:t xml:space="preserve">Automated portfolio construction — searches all combinations of loaded strategies and ranks them by a composite score.</w:t>
-      </w:r>
-    </w:p>
-    <w:p>
-      <w:pPr>
-        <w:spacing w:after="80" w:before="0"/>
-      </w:pPr>
-      <w:r>
-        <w:t xml:space="preserve"/>
-      </w:r>
-    </w:p>
-    <w:p>
-      <w:pPr>
-        <w:pStyle w:val="Heading3"/>
-        <w:spacing w:after="80" w:before="200"/>
-      </w:pPr>
-      <w:r>
-        <w:rPr>
-          <w:rFonts w:ascii="Arial" w:cs="Arial" w:eastAsia="Arial" w:hAnsi="Arial"/>
-          <w:b/>
-          <w:bCs/>
-          <w:color w:val="404040"/>
-          <w:sz w:val="22"/>
-          <w:szCs w:val="22"/>
-        </w:rPr>
-        <w:t xml:space="preserve">Scoring</w:t>
+        <w:t xml:space="preserve">Tabs: Overview, Trades, Equity Chart, Strategies, What-If, Portfolios</w:t>
       </w:r>
     </w:p>
     <w:p>
@@ -3248,7 +3239,7 @@
           <w:sz w:val="22"/>
           <w:szCs w:val="22"/>
         </w:rPr>
-        <w:t xml:space="preserve">Composite weighted score (0–1000) — six sliders: Ret/DD, Stability, Stagnation, Win Rate, Growth Quality, Diversity</w:t>
+        <w:t xml:space="preserve">Overview: combined stats, filters (strategy, symbol, date slider)</w:t>
       </w:r>
     </w:p>
     <w:p>
@@ -3267,7 +3258,7 @@
           <w:sz w:val="22"/>
           <w:szCs w:val="22"/>
         </w:rPr>
-        <w:t xml:space="preserve">Stability (0–100): R² of equity curve linear regression — how straight the curve is</w:t>
+        <w:t xml:space="preserve">Equity Chart: combined equity curve with peak drawdown panel and daily P&amp;L bars, smoothing slider, stagnation band</w:t>
       </w:r>
     </w:p>
     <w:p>
@@ -3286,7 +3277,7 @@
           <w:sz w:val="22"/>
           <w:szCs w:val="22"/>
         </w:rPr>
-        <w:t xml:space="preserve">Growth Quality: normalised slope x R² — rewards consistently rising curves</w:t>
+        <w:t xml:space="preserve">What-If: enter a target lot size to see scaled statistics</w:t>
       </w:r>
     </w:p>
     <w:p>
@@ -3305,7 +3296,48 @@
           <w:sz w:val="22"/>
           <w:szCs w:val="22"/>
         </w:rPr>
-        <w:t xml:space="preserve">Diversity (0–100): symbol variety and trading session overlap</w:t>
+        <w:t xml:space="preserve">Portfolios tab: create and name custom sub-portfolios from loaded strategies</w:t>
+      </w:r>
+    </w:p>
+    <w:p>
+      <w:pPr>
+        <w:spacing w:after="80" w:before="0"/>
+      </w:pPr>
+      <w:r>
+        <w:t xml:space="preserve"/>
+      </w:r>
+    </w:p>
+    <w:p>
+      <w:pPr>
+        <w:pStyle w:val="Heading2"/>
+        <w:spacing w:after="120" w:before="280"/>
+      </w:pPr>
+      <w:r>
+        <w:rPr>
+          <w:rFonts w:ascii="Arial" w:cs="Arial" w:eastAsia="Arial" w:hAnsi="Arial"/>
+          <w:b/>
+          <w:bCs/>
+          <w:color w:val="2E75B6"/>
+          <w:sz w:val="24"/>
+          <w:szCs w:val="24"/>
+        </w:rPr>
+        <w:t xml:space="preserve">4.4  Portfolio Master</w:t>
+      </w:r>
+    </w:p>
+    <w:p>
+      <w:pPr>
+        <w:spacing w:after="60" w:before="60"/>
+      </w:pPr>
+      <w:r>
+        <w:rPr>
+          <w:rFonts w:ascii="Arial" w:cs="Arial" w:eastAsia="Arial" w:hAnsi="Arial"/>
+          <w:b w:val="false"/>
+          <w:bCs w:val="false"/>
+          <w:color w:val="404040"/>
+          <w:sz w:val="22"/>
+          <w:szCs w:val="22"/>
+        </w:rPr>
+        <w:t xml:space="preserve">Automated portfolio construction — searches all combinations of loaded strategies and ranks them by a composite score.</w:t>
       </w:r>
     </w:p>
     <w:p>
@@ -3330,7 +3362,7 @@
           <w:sz w:val="22"/>
           <w:szCs w:val="22"/>
         </w:rPr>
-        <w:t xml:space="preserve">Search modes</w:t>
+        <w:t xml:space="preserve">Scoring</w:t>
       </w:r>
     </w:p>
     <w:p>
@@ -3349,7 +3381,7 @@
           <w:sz w:val="22"/>
           <w:szCs w:val="22"/>
         </w:rPr>
-        <w:t xml:space="preserve">Exhaustive: evaluates every combination — combination count and estimated time shown before run</w:t>
+        <w:t xml:space="preserve">Composite weighted score (0–1000) — six sliders: Ret/DD, Stability, Stagnation, Win Rate, Growth Quality, Diversity</w:t>
       </w:r>
     </w:p>
     <w:p>
@@ -3368,7 +3400,7 @@
           <w:sz w:val="22"/>
           <w:szCs w:val="22"/>
         </w:rPr>
-        <w:t xml:space="preserve">Greedy (fast): incremental build from each strategy as a starting seed</w:t>
+        <w:t xml:space="preserve">Stability (0–100): R² of equity curve linear regression — how straight the curve is</w:t>
       </w:r>
     </w:p>
     <w:p>
@@ -3387,7 +3419,7 @@
           <w:sz w:val="22"/>
           <w:szCs w:val="22"/>
         </w:rPr>
-        <w:t xml:space="preserve">Monte Carlo: random sampling — configure sample count</w:t>
+        <w:t xml:space="preserve">Growth Quality: normalised slope x R² — rewards consistently rising curves</w:t>
       </w:r>
     </w:p>
     <w:p>
@@ -3406,31 +3438,7 @@
           <w:sz w:val="22"/>
           <w:szCs w:val="22"/>
         </w:rPr>
-        <w:t xml:space="preserve">Greedy + Monte Carlo: runs both and deduplicates results</w:t>
-      </w:r>
-    </w:p>
-    <w:p>
-      <w:pPr>
-        <w:spacing w:after="80" w:before="0"/>
-      </w:pPr>
-      <w:r>
-        <w:t xml:space="preserve"/>
-      </w:r>
-    </w:p>
-    <w:p>
-      <w:pPr>
-        <w:spacing w:after="60" w:before="60"/>
-      </w:pPr>
-      <w:r>
-        <w:rPr>
-          <w:rFonts w:ascii="Arial" w:cs="Arial" w:eastAsia="Arial" w:hAnsi="Arial"/>
-          <w:b w:val="false"/>
-          <w:bCs w:val="false"/>
-          <w:color w:val="404040"/>
-          <w:sz w:val="22"/>
-          <w:szCs w:val="22"/>
-        </w:rPr>
-        <w:t xml:space="preserve">A cancel button stops the search mid-run and returns whatever results have been found so far. The search runs in a background thread so the UI stays responsive.</w:t>
+        <w:t xml:space="preserve">Diversity (0–100): symbol variety and trading session overlap</w:t>
       </w:r>
     </w:p>
     <w:p>
@@ -3455,7 +3463,7 @@
           <w:sz w:val="22"/>
           <w:szCs w:val="22"/>
         </w:rPr>
-        <w:t xml:space="preserve">Correlation</w:t>
+        <w:t xml:space="preserve">Search modes</w:t>
       </w:r>
     </w:p>
     <w:p>
@@ -3474,7 +3482,7 @@
           <w:sz w:val="22"/>
           <w:szCs w:val="22"/>
         </w:rPr>
-        <w:t xml:space="preserve">Pairwise correlation filter — portfolios with any pair above the threshold are excluded</w:t>
+        <w:t xml:space="preserve">Exhaustive: evaluates every combination — combination count and estimated time shown before run</w:t>
       </w:r>
     </w:p>
     <w:p>
@@ -3493,7 +3501,7 @@
           <w:sz w:val="22"/>
           <w:szCs w:val="22"/>
         </w:rPr>
-        <w:t xml:space="preserve">Average pairwise correlation shown as output metric</w:t>
+        <w:t xml:space="preserve">Greedy (fast): incremental build from each strategy as a starting seed</w:t>
       </w:r>
     </w:p>
     <w:p>
@@ -3512,56 +3520,7 @@
           <w:sz w:val="22"/>
           <w:szCs w:val="22"/>
         </w:rPr>
-        <w:t xml:space="preserve">Conditional correlation (drawdown days only) — measures how strategies co-move during losses, shown alongside standard correlation in both the Strategy Stats tab and per-result detail expanders</w:t>
-      </w:r>
-    </w:p>
-    <w:p>
-      <w:pPr>
-        <w:spacing w:after="80" w:before="0"/>
-      </w:pPr>
-      <w:r>
-        <w:t xml:space="preserve"/>
-      </w:r>
-    </w:p>
-    <w:p>
-      <w:pPr>
-        <w:pStyle w:val="Heading2"/>
-        <w:spacing w:after="120" w:before="280"/>
-      </w:pPr>
-      <w:r>
-        <w:rPr>
-          <w:rFonts w:ascii="Arial" w:cs="Arial" w:eastAsia="Arial" w:hAnsi="Arial"/>
-          <w:b/>
-          <w:bCs/>
-          <w:color w:val="2E75B6"/>
-          <w:sz w:val="24"/>
-          <w:szCs w:val="24"/>
-        </w:rPr>
-        <w:t xml:space="preserve">4.5  EA Settings Comparator</w:t>
-      </w:r>
-    </w:p>
-    <w:p>
-      <w:pPr>
-        <w:spacing w:after="60" w:before="60"/>
-      </w:pPr>
-      <w:r>
-        <w:rPr>
-          <w:rFonts w:ascii="Arial" w:cs="Arial" w:eastAsia="Arial" w:hAnsi="Arial"/>
-          <w:b w:val="false"/>
-          <w:bCs w:val="false"/>
-          <w:color w:val="404040"/>
-          <w:sz w:val="22"/>
-          <w:szCs w:val="22"/>
-        </w:rPr>
-        <w:t xml:space="preserve">Upload 2–10 MT5 .set files and compare parameters side-by-side.</w:t>
-      </w:r>
-    </w:p>
-    <w:p>
-      <w:pPr>
-        <w:spacing w:after="80" w:before="0"/>
-      </w:pPr>
-      <w:r>
-        <w:t xml:space="preserve"/>
+        <w:t xml:space="preserve">Monte Carlo: random sampling — configure sample count</w:t>
       </w:r>
     </w:p>
     <w:p>
@@ -3580,7 +3539,56 @@
           <w:sz w:val="22"/>
           <w:szCs w:val="22"/>
         </w:rPr>
-        <w:t xml:space="preserve">Parameter comparison table with percentage variation highlighting</w:t>
+        <w:t xml:space="preserve">Greedy + Monte Carlo: runs both and deduplicates results</w:t>
+      </w:r>
+    </w:p>
+    <w:p>
+      <w:pPr>
+        <w:spacing w:after="80" w:before="0"/>
+      </w:pPr>
+      <w:r>
+        <w:t xml:space="preserve"/>
+      </w:r>
+    </w:p>
+    <w:p>
+      <w:pPr>
+        <w:spacing w:after="60" w:before="60"/>
+      </w:pPr>
+      <w:r>
+        <w:rPr>
+          <w:rFonts w:ascii="Arial" w:cs="Arial" w:eastAsia="Arial" w:hAnsi="Arial"/>
+          <w:b w:val="false"/>
+          <w:bCs w:val="false"/>
+          <w:color w:val="404040"/>
+          <w:sz w:val="22"/>
+          <w:szCs w:val="22"/>
+        </w:rPr>
+        <w:t xml:space="preserve">A cancel button stops the search mid-run and returns whatever results have been found so far. The search runs in a background thread so the UI stays responsive.</w:t>
+      </w:r>
+    </w:p>
+    <w:p>
+      <w:pPr>
+        <w:spacing w:after="80" w:before="0"/>
+      </w:pPr>
+      <w:r>
+        <w:t xml:space="preserve"/>
+      </w:r>
+    </w:p>
+    <w:p>
+      <w:pPr>
+        <w:pStyle w:val="Heading3"/>
+        <w:spacing w:after="80" w:before="200"/>
+      </w:pPr>
+      <w:r>
+        <w:rPr>
+          <w:rFonts w:ascii="Arial" w:cs="Arial" w:eastAsia="Arial" w:hAnsi="Arial"/>
+          <w:b/>
+          <w:bCs/>
+          <w:color w:val="404040"/>
+          <w:sz w:val="22"/>
+          <w:szCs w:val="22"/>
+        </w:rPr>
+        <w:t xml:space="preserve">Correlation</w:t>
       </w:r>
     </w:p>
     <w:p>
@@ -3599,7 +3607,7 @@
           <w:sz w:val="22"/>
           <w:szCs w:val="22"/>
         </w:rPr>
-        <w:t xml:space="preserve">Source file selector for comparison baseline</w:t>
+        <w:t xml:space="preserve">Pairwise correlation filter — portfolios with any pair above the threshold are excluded</w:t>
       </w:r>
     </w:p>
     <w:p>
@@ -3618,7 +3626,7 @@
           <w:sz w:val="22"/>
           <w:szCs w:val="22"/>
         </w:rPr>
-        <w:t xml:space="preserve">Show differences only toggle</w:t>
+        <w:t xml:space="preserve">Average pairwise correlation shown as output metric</w:t>
       </w:r>
     </w:p>
     <w:p>
@@ -3637,7 +3645,56 @@
           <w:sz w:val="22"/>
           <w:szCs w:val="22"/>
         </w:rPr>
-        <w:t xml:space="preserve">Inline editing via data editor</w:t>
+        <w:t xml:space="preserve">Conditional correlation (drawdown days only) — measures how strategies co-move during losses, shown alongside standard correlation in both the Strategy Stats tab and per-result detail expanders</w:t>
+      </w:r>
+    </w:p>
+    <w:p>
+      <w:pPr>
+        <w:spacing w:after="80" w:before="0"/>
+      </w:pPr>
+      <w:r>
+        <w:t xml:space="preserve"/>
+      </w:r>
+    </w:p>
+    <w:p>
+      <w:pPr>
+        <w:pStyle w:val="Heading2"/>
+        <w:spacing w:after="120" w:before="280"/>
+      </w:pPr>
+      <w:r>
+        <w:rPr>
+          <w:rFonts w:ascii="Arial" w:cs="Arial" w:eastAsia="Arial" w:hAnsi="Arial"/>
+          <w:b/>
+          <w:bCs/>
+          <w:color w:val="2E75B6"/>
+          <w:sz w:val="24"/>
+          <w:szCs w:val="24"/>
+        </w:rPr>
+        <w:t xml:space="preserve">4.5  EA Settings Comparator</w:t>
+      </w:r>
+    </w:p>
+    <w:p>
+      <w:pPr>
+        <w:spacing w:after="60" w:before="60"/>
+      </w:pPr>
+      <w:r>
+        <w:rPr>
+          <w:rFonts w:ascii="Arial" w:cs="Arial" w:eastAsia="Arial" w:hAnsi="Arial"/>
+          <w:b w:val="false"/>
+          <w:bCs w:val="false"/>
+          <w:color w:val="404040"/>
+          <w:sz w:val="22"/>
+          <w:szCs w:val="22"/>
+        </w:rPr>
+        <w:t xml:space="preserve">Upload 2–10 MT5 .set files and compare parameters side-by-side.</w:t>
+      </w:r>
+    </w:p>
+    <w:p>
+      <w:pPr>
+        <w:spacing w:after="80" w:before="0"/>
+      </w:pPr>
+      <w:r>
+        <w:t xml:space="preserve"/>
       </w:r>
     </w:p>
     <w:p>
@@ -3656,6 +3713,82 @@
           <w:sz w:val="22"/>
           <w:szCs w:val="22"/>
         </w:rPr>
+        <w:t xml:space="preserve">Parameter comparison table with percentage variation highlighting</w:t>
+      </w:r>
+    </w:p>
+    <w:p>
+      <w:pPr>
+        <w:pStyle w:val="ListParagraph"/>
+        <w:numPr>
+          <w:ilvl w:val="0"/>
+          <w:numId w:val="2"/>
+        </w:numPr>
+        <w:spacing w:after="40" w:before="40"/>
+      </w:pPr>
+      <w:r>
+        <w:rPr>
+          <w:rFonts w:ascii="Arial" w:cs="Arial" w:eastAsia="Arial" w:hAnsi="Arial"/>
+          <w:color w:val="404040"/>
+          <w:sz w:val="22"/>
+          <w:szCs w:val="22"/>
+        </w:rPr>
+        <w:t xml:space="preserve">Source file selector for comparison baseline</w:t>
+      </w:r>
+    </w:p>
+    <w:p>
+      <w:pPr>
+        <w:pStyle w:val="ListParagraph"/>
+        <w:numPr>
+          <w:ilvl w:val="0"/>
+          <w:numId w:val="2"/>
+        </w:numPr>
+        <w:spacing w:after="40" w:before="40"/>
+      </w:pPr>
+      <w:r>
+        <w:rPr>
+          <w:rFonts w:ascii="Arial" w:cs="Arial" w:eastAsia="Arial" w:hAnsi="Arial"/>
+          <w:color w:val="404040"/>
+          <w:sz w:val="22"/>
+          <w:szCs w:val="22"/>
+        </w:rPr>
+        <w:t xml:space="preserve">Show differences only toggle</w:t>
+      </w:r>
+    </w:p>
+    <w:p>
+      <w:pPr>
+        <w:pStyle w:val="ListParagraph"/>
+        <w:numPr>
+          <w:ilvl w:val="0"/>
+          <w:numId w:val="2"/>
+        </w:numPr>
+        <w:spacing w:after="40" w:before="40"/>
+      </w:pPr>
+      <w:r>
+        <w:rPr>
+          <w:rFonts w:ascii="Arial" w:cs="Arial" w:eastAsia="Arial" w:hAnsi="Arial"/>
+          <w:color w:val="404040"/>
+          <w:sz w:val="22"/>
+          <w:szCs w:val="22"/>
+        </w:rPr>
+        <w:t xml:space="preserve">Inline editing via data editor</w:t>
+      </w:r>
+    </w:p>
+    <w:p>
+      <w:pPr>
+        <w:pStyle w:val="ListParagraph"/>
+        <w:numPr>
+          <w:ilvl w:val="0"/>
+          <w:numId w:val="2"/>
+        </w:numPr>
+        <w:spacing w:after="40" w:before="40"/>
+      </w:pPr>
+      <w:r>
+        <w:rPr>
+          <w:rFonts w:ascii="Arial" w:cs="Arial" w:eastAsia="Arial" w:hAnsi="Arial"/>
+          <w:color w:val="404040"/>
+          <w:sz w:val="22"/>
+          <w:szCs w:val="22"/>
+        </w:rPr>
         <w:t xml:space="preserve">Export single file or all files as ZIP</w:t>
       </w:r>
     </w:p>
@@ -3681,7 +3814,281 @@
           <w:sz w:val="24"/>
           <w:szCs w:val="24"/>
         </w:rPr>
-        <w:t xml:space="preserve">4.6  Batch Backtest</w:t>
+        <w:t xml:space="preserve">4.6  Settings</w:t>
+      </w:r>
+    </w:p>
+    <w:p>
+      <w:pPr>
+        <w:spacing w:after="60" w:before="60"/>
+      </w:pPr>
+      <w:r>
+        <w:rPr>
+          <w:rFonts w:ascii="Arial" w:cs="Arial" w:eastAsia="Arial" w:hAnsi="Arial"/>
+          <w:b w:val="false"/>
+          <w:bCs w:val="false"/>
+          <w:color w:val="404040"/>
+          <w:sz w:val="22"/>
+          <w:szCs w:val="22"/>
+        </w:rPr>
+        <w:t xml:space="preserve">Controls for theme, custom colours and text size.</w:t>
+      </w:r>
+    </w:p>
+    <w:p>
+      <w:pPr>
+        <w:spacing w:after="80" w:before="0"/>
+      </w:pPr>
+      <w:r>
+        <w:t xml:space="preserve"/>
+      </w:r>
+    </w:p>
+    <w:p>
+      <w:pPr>
+        <w:pStyle w:val="Heading3"/>
+        <w:spacing w:after="80" w:before="200"/>
+      </w:pPr>
+      <w:r>
+        <w:rPr>
+          <w:rFonts w:ascii="Arial" w:cs="Arial" w:eastAsia="Arial" w:hAnsi="Arial"/>
+          <w:b/>
+          <w:bCs/>
+          <w:color w:val="404040"/>
+          <w:sz w:val="22"/>
+          <w:szCs w:val="22"/>
+        </w:rPr>
+        <w:t xml:space="preserve">Theme</w:t>
+      </w:r>
+    </w:p>
+    <w:p>
+      <w:pPr>
+        <w:pStyle w:val="ListParagraph"/>
+        <w:numPr>
+          <w:ilvl w:val="0"/>
+          <w:numId w:val="2"/>
+        </w:numPr>
+        <w:spacing w:after="40" w:before="40"/>
+      </w:pPr>
+      <w:r>
+        <w:rPr>
+          <w:rFonts w:ascii="Arial" w:cs="Arial" w:eastAsia="Arial" w:hAnsi="Arial"/>
+          <w:color w:val="404040"/>
+          <w:sz w:val="22"/>
+          <w:szCs w:val="22"/>
+        </w:rPr>
+        <w:t xml:space="preserve">Dark — standard dark theme (default)</w:t>
+      </w:r>
+    </w:p>
+    <w:p>
+      <w:pPr>
+        <w:pStyle w:val="ListParagraph"/>
+        <w:numPr>
+          <w:ilvl w:val="0"/>
+          <w:numId w:val="2"/>
+        </w:numPr>
+        <w:spacing w:after="40" w:before="40"/>
+      </w:pPr>
+      <w:r>
+        <w:rPr>
+          <w:rFonts w:ascii="Arial" w:cs="Arial" w:eastAsia="Arial" w:hAnsi="Arial"/>
+          <w:color w:val="404040"/>
+          <w:sz w:val="22"/>
+          <w:szCs w:val="22"/>
+        </w:rPr>
+        <w:t xml:space="preserve">Light — standard light theme</w:t>
+      </w:r>
+    </w:p>
+    <w:p>
+      <w:pPr>
+        <w:pStyle w:val="ListParagraph"/>
+        <w:numPr>
+          <w:ilvl w:val="0"/>
+          <w:numId w:val="2"/>
+        </w:numPr>
+        <w:spacing w:after="40" w:before="40"/>
+      </w:pPr>
+      <w:r>
+        <w:rPr>
+          <w:rFonts w:ascii="Arial" w:cs="Arial" w:eastAsia="Arial" w:hAnsi="Arial"/>
+          <w:color w:val="404040"/>
+          <w:sz w:val="22"/>
+          <w:szCs w:val="22"/>
+        </w:rPr>
+        <w:t xml:space="preserve">Custom — reveals colour pickers for accent, page background, sidebar background and text colour, plus font selector and base dark/light radio</w:t>
+      </w:r>
+    </w:p>
+    <w:p>
+      <w:pPr>
+        <w:spacing w:after="60" w:before="60"/>
+      </w:pPr>
+      <w:r>
+        <w:rPr>
+          <w:rFonts w:ascii="Arial" w:cs="Arial" w:eastAsia="Arial" w:hAnsi="Arial"/>
+          <w:b w:val="false"/>
+          <w:bCs w:val="false"/>
+          <w:color w:val="404040"/>
+          <w:sz w:val="22"/>
+          <w:szCs w:val="22"/>
+        </w:rPr>
+        <w:t xml:space="preserve">Click Apply Dark Theme, Apply Light Theme, or Apply Custom Theme to save to .streamlit/config.toml and reload. The Custom option remains selected in the radio after a custom theme is applied.</w:t>
+      </w:r>
+    </w:p>
+    <w:p>
+      <w:pPr>
+        <w:spacing w:after="80" w:before="0"/>
+      </w:pPr>
+      <w:r>
+        <w:t xml:space="preserve"/>
+      </w:r>
+    </w:p>
+    <w:p>
+      <w:pPr>
+        <w:pStyle w:val="Heading3"/>
+        <w:spacing w:after="80" w:before="200"/>
+      </w:pPr>
+      <w:r>
+        <w:rPr>
+          <w:rFonts w:ascii="Arial" w:cs="Arial" w:eastAsia="Arial" w:hAnsi="Arial"/>
+          <w:b/>
+          <w:bCs/>
+          <w:color w:val="404040"/>
+          <w:sz w:val="22"/>
+          <w:szCs w:val="22"/>
+        </w:rPr>
+        <w:t xml:space="preserve">Text Size</w:t>
+      </w:r>
+    </w:p>
+    <w:p>
+      <w:pPr>
+        <w:pStyle w:val="ListParagraph"/>
+        <w:numPr>
+          <w:ilvl w:val="0"/>
+          <w:numId w:val="2"/>
+        </w:numPr>
+        <w:spacing w:after="40" w:before="40"/>
+      </w:pPr>
+      <w:r>
+        <w:rPr>
+          <w:rFonts w:ascii="Arial" w:cs="Arial" w:eastAsia="Arial" w:hAnsi="Arial"/>
+          <w:color w:val="404040"/>
+          <w:sz w:val="22"/>
+          <w:szCs w:val="22"/>
+        </w:rPr>
+        <w:t xml:space="preserve">Normal — default Streamlit font size</w:t>
+      </w:r>
+    </w:p>
+    <w:p>
+      <w:pPr>
+        <w:pStyle w:val="ListParagraph"/>
+        <w:numPr>
+          <w:ilvl w:val="0"/>
+          <w:numId w:val="2"/>
+        </w:numPr>
+        <w:spacing w:after="40" w:before="40"/>
+      </w:pPr>
+      <w:r>
+        <w:rPr>
+          <w:rFonts w:ascii="Arial" w:cs="Arial" w:eastAsia="Arial" w:hAnsi="Arial"/>
+          <w:color w:val="404040"/>
+          <w:sz w:val="22"/>
+          <w:szCs w:val="22"/>
+        </w:rPr>
+        <w:t xml:space="preserve">Large (+2px) — all text increased by 2px via CSS injection</w:t>
+      </w:r>
+    </w:p>
+    <w:p>
+      <w:pPr>
+        <w:pStyle w:val="ListParagraph"/>
+        <w:numPr>
+          <w:ilvl w:val="0"/>
+          <w:numId w:val="2"/>
+        </w:numPr>
+        <w:spacing w:after="40" w:before="40"/>
+      </w:pPr>
+      <w:r>
+        <w:rPr>
+          <w:rFonts w:ascii="Arial" w:cs="Arial" w:eastAsia="Arial" w:hAnsi="Arial"/>
+          <w:color w:val="404040"/>
+          <w:sz w:val="22"/>
+          <w:szCs w:val="22"/>
+        </w:rPr>
+        <w:t xml:space="preserve">Extra Large (+4px) — all text increased by 4px</w:t>
+      </w:r>
+    </w:p>
+    <w:p>
+      <w:pPr>
+        <w:spacing w:after="60" w:before="60"/>
+      </w:pPr>
+      <w:r>
+        <w:rPr>
+          <w:rFonts w:ascii="Arial" w:cs="Arial" w:eastAsia="Arial" w:hAnsi="Arial"/>
+          <w:b w:val="false"/>
+          <w:bCs w:val="false"/>
+          <w:color w:val="404040"/>
+          <w:sz w:val="22"/>
+          <w:szCs w:val="22"/>
+        </w:rPr>
+        <w:t xml:space="preserve">Text size applies immediately across all pages without a reload.</w:t>
+      </w:r>
+    </w:p>
+    <w:p>
+      <w:pPr>
+        <w:spacing w:after="80" w:before="0"/>
+      </w:pPr>
+      <w:r>
+        <w:t xml:space="preserve"/>
+      </w:r>
+    </w:p>
+    <w:p>
+      <w:pPr>
+        <w:shd w:fill="EBF3FB" w:val="clear"/>
+        <w:spacing w:after="120" w:before="120"/>
+        <w:ind w:left="280" w:right="280"/>
+      </w:pPr>
+      <w:r>
+        <w:rPr>
+          <w:rFonts w:ascii="Arial" w:cs="Arial" w:eastAsia="Arial" w:hAnsi="Arial"/>
+          <w:b/>
+          <w:bCs/>
+          <w:color w:val="2E75B6"/>
+          <w:sz w:val="20"/>
+          <w:szCs w:val="20"/>
+        </w:rPr>
+        <w:t xml:space="preserve">NOTE  </w:t>
+      </w:r>
+      <w:r>
+        <w:rPr>
+          <w:rFonts w:ascii="Arial" w:cs="Arial" w:eastAsia="Arial" w:hAnsi="Arial"/>
+          <w:color w:val="666666"/>
+          <w:sz w:val="20"/>
+          <w:szCs w:val="20"/>
+        </w:rPr>
+        <w:t xml:space="preserve">To apply text size globally on all pages, add these two lines near the top of app.py:
+import view_settings
+view_settings.inject_theme_css()</w:t>
+      </w:r>
+    </w:p>
+    <w:p>
+      <w:pPr>
+        <w:spacing w:after="80" w:before="0"/>
+      </w:pPr>
+      <w:r>
+        <w:t xml:space="preserve"/>
+      </w:r>
+    </w:p>
+    <w:p>
+      <w:pPr>
+        <w:pStyle w:val="Heading2"/>
+        <w:spacing w:after="120" w:before="280"/>
+      </w:pPr>
+      <w:r>
+        <w:rPr>
+          <w:rFonts w:ascii="Arial" w:cs="Arial" w:eastAsia="Arial" w:hAnsi="Arial"/>
+          <w:b/>
+          <w:bCs/>
+          <w:color w:val="2E75B6"/>
+          <w:sz w:val="24"/>
+          <w:szCs w:val="24"/>
+        </w:rPr>
+        <w:t xml:space="preserve">4.7  Batch Backtest</w:t>
       </w:r>
     </w:p>
     <w:p>
@@ -6760,6 +7167,619 @@
           <w:szCs w:val="22"/>
         </w:rPr>
         <w:t xml:space="preserve">Mac/Linux: all features work except Batch Backtest which requires Windows STARTUPINFO and %APPDATA% paths</w:t>
+      </w:r>
+    </w:p>
+    <w:p>
+      <w:r>
+        <w:br w:type="page"/>
+      </w:r>
+    </w:p>
+    <w:p>
+      <w:pPr>
+        <w:pStyle w:val="Heading1"/>
+        <w:pBdr>
+          <w:bottom w:val="single" w:color="2E75B6" w:sz="6" w:space="1"/>
+        </w:pBdr>
+        <w:spacing w:after="160" w:before="360"/>
+      </w:pPr>
+      <w:r>
+        <w:rPr>
+          <w:rFonts w:ascii="Arial" w:cs="Arial" w:eastAsia="Arial" w:hAnsi="Arial"/>
+          <w:b/>
+          <w:bCs/>
+          <w:color w:val="1F3A6E"/>
+          <w:sz w:val="28"/>
+          <w:szCs w:val="28"/>
+        </w:rPr>
+        <w:t xml:space="preserve">9.  Keeping Up to Date</w:t>
+      </w:r>
+    </w:p>
+    <w:p>
+      <w:pPr>
+        <w:spacing w:after="60" w:before="60"/>
+      </w:pPr>
+      <w:r>
+        <w:rPr>
+          <w:rFonts w:ascii="Arial" w:cs="Arial" w:eastAsia="Arial" w:hAnsi="Arial"/>
+          <w:b w:val="false"/>
+          <w:bCs w:val="false"/>
+          <w:color w:val="404040"/>
+          <w:sz w:val="22"/>
+          <w:szCs w:val="22"/>
+        </w:rPr>
+        <w:t xml:space="preserve">MT5 Tools is updated regularly with new features and bug fixes. To update your local installation to the latest version from GitHub:</w:t>
+      </w:r>
+    </w:p>
+    <w:p>
+      <w:pPr>
+        <w:spacing w:after="80" w:before="0"/>
+      </w:pPr>
+      <w:r>
+        <w:t xml:space="preserve"/>
+      </w:r>
+    </w:p>
+    <w:p>
+      <w:pPr>
+        <w:pStyle w:val="Heading2"/>
+        <w:spacing w:after="120" w:before="280"/>
+      </w:pPr>
+      <w:r>
+        <w:rPr>
+          <w:rFonts w:ascii="Arial" w:cs="Arial" w:eastAsia="Arial" w:hAnsi="Arial"/>
+          <w:b/>
+          <w:bCs/>
+          <w:color w:val="2E75B6"/>
+          <w:sz w:val="24"/>
+          <w:szCs w:val="24"/>
+        </w:rPr>
+        <w:t xml:space="preserve">9.1  Pull the latest changes</w:t>
+      </w:r>
+    </w:p>
+    <w:p>
+      <w:pPr>
+        <w:spacing w:after="60" w:before="60"/>
+      </w:pPr>
+      <w:r>
+        <w:rPr>
+          <w:rFonts w:ascii="Arial" w:cs="Arial" w:eastAsia="Arial" w:hAnsi="Arial"/>
+          <w:b w:val="false"/>
+          <w:bCs w:val="false"/>
+          <w:color w:val="404040"/>
+          <w:sz w:val="22"/>
+          <w:szCs w:val="22"/>
+        </w:rPr>
+        <w:t xml:space="preserve">Open a terminal in your MT5Tools folder with the venv active and run:</w:t>
+      </w:r>
+    </w:p>
+    <w:p>
+      <w:pPr>
+        <w:spacing w:after="80" w:before="0"/>
+      </w:pPr>
+      <w:r>
+        <w:t xml:space="preserve"/>
+      </w:r>
+    </w:p>
+    <w:p>
+      <w:pPr>
+        <w:shd w:fill="F0F0F0" w:val="clear"/>
+        <w:spacing w:after="40" w:before="40"/>
+        <w:ind w:left="360"/>
+      </w:pPr>
+      <w:r>
+        <w:rPr>
+          <w:rFonts w:ascii="Courier New" w:cs="Courier New" w:eastAsia="Courier New" w:hAnsi="Courier New"/>
+          <w:color w:val="1A1A1A"/>
+          <w:sz w:val="20"/>
+          <w:szCs w:val="20"/>
+        </w:rPr>
+        <w:t xml:space="preserve">.venv\Scripts\activate</w:t>
+      </w:r>
+    </w:p>
+    <w:p>
+      <w:pPr>
+        <w:shd w:fill="F0F0F0" w:val="clear"/>
+        <w:spacing w:after="40" w:before="40"/>
+        <w:ind w:left="360"/>
+      </w:pPr>
+      <w:r>
+        <w:rPr>
+          <w:rFonts w:ascii="Courier New" w:cs="Courier New" w:eastAsia="Courier New" w:hAnsi="Courier New"/>
+          <w:color w:val="1A1A1A"/>
+          <w:sz w:val="20"/>
+          <w:szCs w:val="20"/>
+        </w:rPr>
+        <w:t xml:space="preserve">git pull</w:t>
+      </w:r>
+    </w:p>
+    <w:p>
+      <w:pPr>
+        <w:spacing w:after="80" w:before="0"/>
+      </w:pPr>
+      <w:r>
+        <w:t xml:space="preserve"/>
+      </w:r>
+    </w:p>
+    <w:p>
+      <w:pPr>
+        <w:spacing w:after="60" w:before="60"/>
+      </w:pPr>
+      <w:r>
+        <w:rPr>
+          <w:rFonts w:ascii="Arial" w:cs="Arial" w:eastAsia="Arial" w:hAnsi="Arial"/>
+          <w:b w:val="false"/>
+          <w:bCs w:val="false"/>
+          <w:color w:val="404040"/>
+          <w:sz w:val="22"/>
+          <w:szCs w:val="22"/>
+        </w:rPr>
+        <w:t xml:space="preserve">This downloads and merges the latest commits from the master branch. If you have no local changes it will apply cleanly. Your mt5_batch_config.json is gitignored so it will not be affected.</w:t>
+      </w:r>
+    </w:p>
+    <w:p>
+      <w:pPr>
+        <w:spacing w:after="80" w:before="0"/>
+      </w:pPr>
+      <w:r>
+        <w:t xml:space="preserve"/>
+      </w:r>
+    </w:p>
+    <w:p>
+      <w:pPr>
+        <w:pStyle w:val="Heading2"/>
+        <w:spacing w:after="120" w:before="280"/>
+      </w:pPr>
+      <w:r>
+        <w:rPr>
+          <w:rFonts w:ascii="Arial" w:cs="Arial" w:eastAsia="Arial" w:hAnsi="Arial"/>
+          <w:b/>
+          <w:bCs/>
+          <w:color w:val="2E75B6"/>
+          <w:sz w:val="24"/>
+          <w:szCs w:val="24"/>
+        </w:rPr>
+        <w:t xml:space="preserve">9.2  Update dependencies</w:t>
+      </w:r>
+    </w:p>
+    <w:p>
+      <w:pPr>
+        <w:spacing w:after="60" w:before="60"/>
+      </w:pPr>
+      <w:r>
+        <w:rPr>
+          <w:rFonts w:ascii="Arial" w:cs="Arial" w:eastAsia="Arial" w:hAnsi="Arial"/>
+          <w:b w:val="false"/>
+          <w:bCs w:val="false"/>
+          <w:color w:val="404040"/>
+          <w:sz w:val="22"/>
+          <w:szCs w:val="22"/>
+        </w:rPr>
+        <w:t xml:space="preserve">After pulling, check whether any new packages have been added to requirements.txt:</w:t>
+      </w:r>
+    </w:p>
+    <w:p>
+      <w:pPr>
+        <w:spacing w:after="80" w:before="0"/>
+      </w:pPr>
+      <w:r>
+        <w:t xml:space="preserve"/>
+      </w:r>
+    </w:p>
+    <w:p>
+      <w:pPr>
+        <w:shd w:fill="F0F0F0" w:val="clear"/>
+        <w:spacing w:after="40" w:before="40"/>
+        <w:ind w:left="360"/>
+      </w:pPr>
+      <w:r>
+        <w:rPr>
+          <w:rFonts w:ascii="Courier New" w:cs="Courier New" w:eastAsia="Courier New" w:hAnsi="Courier New"/>
+          <w:color w:val="1A1A1A"/>
+          <w:sz w:val="20"/>
+          <w:szCs w:val="20"/>
+        </w:rPr>
+        <w:t xml:space="preserve">pip install -r requirements.txt</w:t>
+      </w:r>
+    </w:p>
+    <w:p>
+      <w:pPr>
+        <w:spacing w:after="80" w:before="0"/>
+      </w:pPr>
+      <w:r>
+        <w:t xml:space="preserve"/>
+      </w:r>
+    </w:p>
+    <w:p>
+      <w:pPr>
+        <w:spacing w:after="60" w:before="60"/>
+      </w:pPr>
+      <w:r>
+        <w:rPr>
+          <w:rFonts w:ascii="Arial" w:cs="Arial" w:eastAsia="Arial" w:hAnsi="Arial"/>
+          <w:b w:val="false"/>
+          <w:bCs w:val="false"/>
+          <w:color w:val="404040"/>
+          <w:sz w:val="22"/>
+          <w:szCs w:val="22"/>
+        </w:rPr>
+        <w:t xml:space="preserve">pip will skip packages already installed at the correct version and only install anything new.</w:t>
+      </w:r>
+    </w:p>
+    <w:p>
+      <w:pPr>
+        <w:spacing w:after="80" w:before="0"/>
+      </w:pPr>
+      <w:r>
+        <w:t xml:space="preserve"/>
+      </w:r>
+    </w:p>
+    <w:p>
+      <w:pPr>
+        <w:pStyle w:val="Heading2"/>
+        <w:spacing w:after="120" w:before="280"/>
+      </w:pPr>
+      <w:r>
+        <w:rPr>
+          <w:rFonts w:ascii="Arial" w:cs="Arial" w:eastAsia="Arial" w:hAnsi="Arial"/>
+          <w:b/>
+          <w:bCs/>
+          <w:color w:val="2E75B6"/>
+          <w:sz w:val="24"/>
+          <w:szCs w:val="24"/>
+        </w:rPr>
+        <w:t xml:space="preserve">9.3  Restart the dashboard</w:t>
+      </w:r>
+    </w:p>
+    <w:p>
+      <w:pPr>
+        <w:shd w:fill="F0F0F0" w:val="clear"/>
+        <w:spacing w:after="40" w:before="40"/>
+        <w:ind w:left="360"/>
+      </w:pPr>
+      <w:r>
+        <w:rPr>
+          <w:rFonts w:ascii="Courier New" w:cs="Courier New" w:eastAsia="Courier New" w:hAnsi="Courier New"/>
+          <w:color w:val="1A1A1A"/>
+          <w:sz w:val="20"/>
+          <w:szCs w:val="20"/>
+        </w:rPr>
+        <w:t xml:space="preserve">streamlit run app.py</w:t>
+      </w:r>
+    </w:p>
+    <w:p>
+      <w:pPr>
+        <w:spacing w:after="80" w:before="0"/>
+      </w:pPr>
+      <w:r>
+        <w:t xml:space="preserve"/>
+      </w:r>
+    </w:p>
+    <w:p>
+      <w:pPr>
+        <w:spacing w:after="60" w:before="60"/>
+      </w:pPr>
+      <w:r>
+        <w:rPr>
+          <w:rFonts w:ascii="Arial" w:cs="Arial" w:eastAsia="Arial" w:hAnsi="Arial"/>
+          <w:b w:val="false"/>
+          <w:bCs w:val="false"/>
+          <w:color w:val="404040"/>
+          <w:sz w:val="22"/>
+          <w:szCs w:val="22"/>
+        </w:rPr>
+        <w:t xml:space="preserve">Streamlit caches modules between runs. After a git pull always do a full restart rather than using the Rerun button in the browser — this ensures the updated code is loaded.</w:t>
+      </w:r>
+    </w:p>
+    <w:p>
+      <w:pPr>
+        <w:spacing w:after="80" w:before="0"/>
+      </w:pPr>
+      <w:r>
+        <w:t xml:space="preserve"/>
+      </w:r>
+    </w:p>
+    <w:p>
+      <w:pPr>
+        <w:pStyle w:val="Heading2"/>
+        <w:spacing w:after="120" w:before="280"/>
+      </w:pPr>
+      <w:r>
+        <w:rPr>
+          <w:rFonts w:ascii="Arial" w:cs="Arial" w:eastAsia="Arial" w:hAnsi="Arial"/>
+          <w:b/>
+          <w:bCs/>
+          <w:color w:val="2E75B6"/>
+          <w:sz w:val="24"/>
+          <w:szCs w:val="24"/>
+        </w:rPr>
+        <w:t xml:space="preserve">9.4  If you have local changes</w:t>
+      </w:r>
+    </w:p>
+    <w:p>
+      <w:pPr>
+        <w:spacing w:after="60" w:before="60"/>
+      </w:pPr>
+      <w:r>
+        <w:rPr>
+          <w:rFonts w:ascii="Arial" w:cs="Arial" w:eastAsia="Arial" w:hAnsi="Arial"/>
+          <w:b w:val="false"/>
+          <w:bCs w:val="false"/>
+          <w:color w:val="404040"/>
+          <w:sz w:val="22"/>
+          <w:szCs w:val="22"/>
+        </w:rPr>
+        <w:t xml:space="preserve">If you have edited any files locally and git pull reports a conflict, you have two options:</w:t>
+      </w:r>
+    </w:p>
+    <w:p>
+      <w:pPr>
+        <w:spacing w:after="80" w:before="0"/>
+      </w:pPr>
+      <w:r>
+        <w:t xml:space="preserve"/>
+      </w:r>
+    </w:p>
+    <w:p>
+      <w:pPr>
+        <w:pStyle w:val="ListParagraph"/>
+        <w:numPr>
+          <w:ilvl w:val="0"/>
+          <w:numId w:val="2"/>
+        </w:numPr>
+        <w:spacing w:after="40" w:before="40"/>
+      </w:pPr>
+      <w:r>
+        <w:rPr>
+          <w:rFonts w:ascii="Arial" w:cs="Arial" w:eastAsia="Arial" w:hAnsi="Arial"/>
+          <w:b/>
+          <w:bCs/>
+          <w:color w:val="404040"/>
+          <w:sz w:val="22"/>
+          <w:szCs w:val="22"/>
+        </w:rPr>
+        <w:t xml:space="preserve">Option A — </w:t>
+      </w:r>
+      <w:r>
+        <w:rPr>
+          <w:rFonts w:ascii="Arial" w:cs="Arial" w:eastAsia="Arial" w:hAnsi="Arial"/>
+          <w:color w:val="404040"/>
+          <w:sz w:val="22"/>
+          <w:szCs w:val="22"/>
+        </w:rPr>
+        <w:t xml:space="preserve">Stash your changes, pull, then reapply:</w:t>
+      </w:r>
+    </w:p>
+    <w:p>
+      <w:pPr>
+        <w:shd w:fill="F0F0F0" w:val="clear"/>
+        <w:spacing w:after="40" w:before="40"/>
+        <w:ind w:left="360"/>
+      </w:pPr>
+      <w:r>
+        <w:rPr>
+          <w:rFonts w:ascii="Courier New" w:cs="Courier New" w:eastAsia="Courier New" w:hAnsi="Courier New"/>
+          <w:color w:val="1A1A1A"/>
+          <w:sz w:val="20"/>
+          <w:szCs w:val="20"/>
+        </w:rPr>
+        <w:t xml:space="preserve">git stash</w:t>
+      </w:r>
+    </w:p>
+    <w:p>
+      <w:pPr>
+        <w:shd w:fill="F0F0F0" w:val="clear"/>
+        <w:spacing w:after="40" w:before="40"/>
+        <w:ind w:left="360"/>
+      </w:pPr>
+      <w:r>
+        <w:rPr>
+          <w:rFonts w:ascii="Courier New" w:cs="Courier New" w:eastAsia="Courier New" w:hAnsi="Courier New"/>
+          <w:color w:val="1A1A1A"/>
+          <w:sz w:val="20"/>
+          <w:szCs w:val="20"/>
+        </w:rPr>
+        <w:t xml:space="preserve">git pull</w:t>
+      </w:r>
+    </w:p>
+    <w:p>
+      <w:pPr>
+        <w:shd w:fill="F0F0F0" w:val="clear"/>
+        <w:spacing w:after="40" w:before="40"/>
+        <w:ind w:left="360"/>
+      </w:pPr>
+      <w:r>
+        <w:rPr>
+          <w:rFonts w:ascii="Courier New" w:cs="Courier New" w:eastAsia="Courier New" w:hAnsi="Courier New"/>
+          <w:color w:val="1A1A1A"/>
+          <w:sz w:val="20"/>
+          <w:szCs w:val="20"/>
+        </w:rPr>
+        <w:t xml:space="preserve">git stash pop</w:t>
+      </w:r>
+    </w:p>
+    <w:p>
+      <w:pPr>
+        <w:spacing w:after="80" w:before="0"/>
+      </w:pPr>
+      <w:r>
+        <w:t xml:space="preserve"/>
+      </w:r>
+    </w:p>
+    <w:p>
+      <w:pPr>
+        <w:pStyle w:val="ListParagraph"/>
+        <w:numPr>
+          <w:ilvl w:val="0"/>
+          <w:numId w:val="2"/>
+        </w:numPr>
+        <w:spacing w:after="40" w:before="40"/>
+      </w:pPr>
+      <w:r>
+        <w:rPr>
+          <w:rFonts w:ascii="Arial" w:cs="Arial" w:eastAsia="Arial" w:hAnsi="Arial"/>
+          <w:b/>
+          <w:bCs/>
+          <w:color w:val="404040"/>
+          <w:sz w:val="22"/>
+          <w:szCs w:val="22"/>
+        </w:rPr>
+        <w:t xml:space="preserve">Option B — </w:t>
+      </w:r>
+      <w:r>
+        <w:rPr>
+          <w:rFonts w:ascii="Arial" w:cs="Arial" w:eastAsia="Arial" w:hAnsi="Arial"/>
+          <w:color w:val="404040"/>
+          <w:sz w:val="22"/>
+          <w:szCs w:val="22"/>
+        </w:rPr>
+        <w:t xml:space="preserve">Discard your local changes and take the latest version entirely:</w:t>
+      </w:r>
+    </w:p>
+    <w:p>
+      <w:pPr>
+        <w:shd w:fill="F0F0F0" w:val="clear"/>
+        <w:spacing w:after="40" w:before="40"/>
+        <w:ind w:left="360"/>
+      </w:pPr>
+      <w:r>
+        <w:rPr>
+          <w:rFonts w:ascii="Courier New" w:cs="Courier New" w:eastAsia="Courier New" w:hAnsi="Courier New"/>
+          <w:color w:val="1A1A1A"/>
+          <w:sz w:val="20"/>
+          <w:szCs w:val="20"/>
+        </w:rPr>
+        <w:t xml:space="preserve">git fetch origin</w:t>
+      </w:r>
+    </w:p>
+    <w:p>
+      <w:pPr>
+        <w:shd w:fill="F0F0F0" w:val="clear"/>
+        <w:spacing w:after="40" w:before="40"/>
+        <w:ind w:left="360"/>
+      </w:pPr>
+      <w:r>
+        <w:rPr>
+          <w:rFonts w:ascii="Courier New" w:cs="Courier New" w:eastAsia="Courier New" w:hAnsi="Courier New"/>
+          <w:color w:val="1A1A1A"/>
+          <w:sz w:val="20"/>
+          <w:szCs w:val="20"/>
+        </w:rPr>
+        <w:t xml:space="preserve">git reset --hard origin/master</w:t>
+      </w:r>
+    </w:p>
+    <w:p>
+      <w:pPr>
+        <w:spacing w:after="80" w:before="0"/>
+      </w:pPr>
+      <w:r>
+        <w:t xml:space="preserve"/>
+      </w:r>
+    </w:p>
+    <w:p>
+      <w:pPr>
+        <w:shd w:fill="EBF3FB" w:val="clear"/>
+        <w:spacing w:after="120" w:before="120"/>
+        <w:ind w:left="280" w:right="280"/>
+      </w:pPr>
+      <w:r>
+        <w:rPr>
+          <w:rFonts w:ascii="Arial" w:cs="Arial" w:eastAsia="Arial" w:hAnsi="Arial"/>
+          <w:b/>
+          <w:bCs/>
+          <w:color w:val="2E75B6"/>
+          <w:sz w:val="20"/>
+          <w:szCs w:val="20"/>
+        </w:rPr>
+        <w:t xml:space="preserve">NOTE  </w:t>
+      </w:r>
+      <w:r>
+        <w:rPr>
+          <w:rFonts w:ascii="Arial" w:cs="Arial" w:eastAsia="Arial" w:hAnsi="Arial"/>
+          <w:color w:val="666666"/>
+          <w:sz w:val="20"/>
+          <w:szCs w:val="20"/>
+        </w:rPr>
+        <w:t xml:space="preserve">Option B will permanently discard any uncommitted local edits. Only use it if you are happy to lose those changes.</w:t>
+      </w:r>
+    </w:p>
+    <w:p>
+      <w:pPr>
+        <w:spacing w:after="80" w:before="0"/>
+      </w:pPr>
+      <w:r>
+        <w:t xml:space="preserve"/>
+      </w:r>
+    </w:p>
+    <w:p>
+      <w:pPr>
+        <w:pStyle w:val="Heading2"/>
+        <w:spacing w:after="120" w:before="280"/>
+      </w:pPr>
+      <w:r>
+        <w:rPr>
+          <w:rFonts w:ascii="Arial" w:cs="Arial" w:eastAsia="Arial" w:hAnsi="Arial"/>
+          <w:b/>
+          <w:bCs/>
+          <w:color w:val="2E75B6"/>
+          <w:sz w:val="24"/>
+          <w:szCs w:val="24"/>
+        </w:rPr>
+        <w:t xml:space="preserve">9.5  Check your current version</w:t>
+      </w:r>
+    </w:p>
+    <w:p>
+      <w:pPr>
+        <w:spacing w:after="60" w:before="60"/>
+      </w:pPr>
+      <w:r>
+        <w:rPr>
+          <w:rFonts w:ascii="Arial" w:cs="Arial" w:eastAsia="Arial" w:hAnsi="Arial"/>
+          <w:b w:val="false"/>
+          <w:bCs w:val="false"/>
+          <w:color w:val="404040"/>
+          <w:sz w:val="22"/>
+          <w:szCs w:val="22"/>
+        </w:rPr>
+        <w:t xml:space="preserve">To see which commit you are currently on:</w:t>
+      </w:r>
+    </w:p>
+    <w:p>
+      <w:pPr>
+        <w:shd w:fill="F0F0F0" w:val="clear"/>
+        <w:spacing w:after="40" w:before="40"/>
+        <w:ind w:left="360"/>
+      </w:pPr>
+      <w:r>
+        <w:rPr>
+          <w:rFonts w:ascii="Courier New" w:cs="Courier New" w:eastAsia="Courier New" w:hAnsi="Courier New"/>
+          <w:color w:val="1A1A1A"/>
+          <w:sz w:val="20"/>
+          <w:szCs w:val="20"/>
+        </w:rPr>
+        <w:t xml:space="preserve">git log --oneline -5</w:t>
+      </w:r>
+    </w:p>
+    <w:p>
+      <w:pPr>
+        <w:spacing w:after="80" w:before="0"/>
+      </w:pPr>
+      <w:r>
+        <w:t xml:space="preserve"/>
+      </w:r>
+    </w:p>
+    <w:p>
+      <w:pPr>
+        <w:spacing w:after="60" w:before="60"/>
+      </w:pPr>
+      <w:r>
+        <w:rPr>
+          <w:rFonts w:ascii="Arial" w:cs="Arial" w:eastAsia="Arial" w:hAnsi="Arial"/>
+          <w:b w:val="false"/>
+          <w:bCs w:val="false"/>
+          <w:color w:val="404040"/>
+          <w:sz w:val="22"/>
+          <w:szCs w:val="22"/>
+        </w:rPr>
+        <w:t xml:space="preserve">This shows the five most recent commits with their short hash and message, so you can confirm you have the latest update.</w:t>
       </w:r>
     </w:p>
     <w:sectPr>

</xml_diff>